<commit_message>
Store converted r at full precision; final ICEEL v2 and ECEL notice
studies.csv kept Peterson-Brown values to 4 decimals, which moved the
ICEEL Table 2 A x LTO slope by 1e-4 and two ECEL notice values in the
last digit. The corrected file now stores them to 6 decimals (the legacy
file is unchanged). ICEEL v2 Table 1 and all Table 2 slopes now match an
independent recomputation from the master extraction with PyMARE.

Co-Authored-By: Claude Opus 5.5 <noreply@anthropic.com>
Claude-Session: https://claude.ai/code/session_01PtLTEUN6Kmos91FTvxtXLu
</commit_message>
<xml_diff>
--- a/metaanalysis/conference_submissions/ecel/erratum/correction_EL-095.docx
+++ b/metaanalysis/conference_submissions/ecel/erratum/correction_EL-095.docx
@@ -321,7 +321,7 @@
               <w:rPr>
                 <w:sz w:val="18"/>
               </w:rPr>
-              <w:t>.821</w:t>
+              <w:t>.822</w:t>
             </w:r>
           </w:p>
         </w:tc>
@@ -468,7 +468,7 @@
               <w:rPr>
                 <w:sz w:val="18"/>
               </w:rPr>
-              <w:t>5.59 (1, 6)</w:t>
+              <w:t>5.60 (1, 6)</w:t>
             </w:r>
           </w:p>
         </w:tc>
@@ -2286,7 +2286,7 @@
         <w:rPr>
           <w:sz w:val="20"/>
         </w:rPr>
-        <w:t xml:space="preserve"> "Agreeableness shows a trend (p = .070)" should read "Agreeableness shows a trend (p = .056)", and "Conscientiousness is exceptionally close to zero on Q (0.015)" should read "Conscientiousness shows essentially no difference (F(1, 7) = 0.05, p = .821)".</w:t>
+        <w:t xml:space="preserve"> "Agreeableness shows a trend (p = .070)" should read "Agreeableness shows a trend (p = .056)", and "Conscientiousness is exceptionally close to zero on Q (0.015)" should read "Conscientiousness shows essentially no difference (F(1, 7) = 0.05, p = .822)".</w:t>
       </w:r>
     </w:p>
     <w:p>
@@ -2304,7 +2304,7 @@
         <w:rPr>
           <w:sz w:val="20"/>
         </w:rPr>
-        <w:t xml:space="preserve"> "0.190 in the asynchronous bucket and 0.180 in the mixed-online bucket — an absolute difference of 0.010 … with a Q_between p of .903" should read "0.209 in the asynchronous bucket and 0.179 in the mixed-online bucket — an absolute difference of 0.030 … with a moderator-test p of .821".</w:t>
+        <w:t xml:space="preserve"> "0.190 in the asynchronous bucket and 0.180 in the mixed-online bucket — an absolute difference of 0.010 … with a Q_between p of .903" should read "0.209 in the asynchronous bucket and 0.179 in the mixed-online bucket — an absolute difference of 0.030 … with a moderator-test p of .822".</w:t>
       </w:r>
     </w:p>
     <w:p>

</xml_diff>